<commit_message>
removed chatGPT from sources
</commit_message>
<xml_diff>
--- a/BKP.docx
+++ b/BKP.docx
@@ -9617,7 +9617,6 @@
         </w:rPr>
         <w:t xml:space="preserve"> </w:t>
       </w:r>
-      <w:proofErr w:type="gramStart"/>
       <w:r>
         <w:rPr>
           <w:rFonts w:cs="Times New Roman"/>
@@ -9644,7 +9643,6 @@
         <w:t>json</w:t>
       </w:r>
       <w:proofErr w:type="spellEnd"/>
-      <w:proofErr w:type="gramEnd"/>
       <w:r>
         <w:rPr>
           <w:rFonts w:cs="Times New Roman"/>
@@ -9702,7 +9700,6 @@
         </w:rPr>
         <w:t>_</w:t>
       </w:r>
-      <w:proofErr w:type="gramStart"/>
       <w:r>
         <w:rPr>
           <w:rFonts w:cs="Times New Roman"/>
@@ -9717,16 +9714,7 @@
           <w:szCs w:val="28"/>
           <w:lang w:val="ru-RU" w:eastAsia="ru-RU"/>
         </w:rPr>
-        <w:t>(</w:t>
-      </w:r>
-      <w:proofErr w:type="gramEnd"/>
-      <w:r>
-        <w:rPr>
-          <w:rFonts w:cs="Times New Roman"/>
-          <w:szCs w:val="28"/>
-          <w:lang w:val="ru-RU" w:eastAsia="ru-RU"/>
-        </w:rPr>
-        <w:t xml:space="preserve">), которая разбивает общий период на месячные интервалы. Такой подход снижает риск получения слишком больших ответов от </w:t>
+        <w:t xml:space="preserve">(), которая разбивает общий период на месячные интервалы. Такой подход снижает риск получения слишком больших ответов от </w:t>
       </w:r>
       <w:r>
         <w:rPr>
@@ -11006,7 +10994,6 @@
         </w:rPr>
         <w:t>_</w:t>
       </w:r>
-      <w:proofErr w:type="gramStart"/>
       <w:r>
         <w:rPr>
           <w:rFonts w:cs="Times New Roman"/>
@@ -11031,7 +11018,6 @@
         </w:rPr>
         <w:t>parquet</w:t>
       </w:r>
-      <w:proofErr w:type="gramEnd"/>
       <w:r>
         <w:rPr>
           <w:rFonts w:cs="Times New Roman"/>
@@ -11131,7 +11117,6 @@
         </w:rPr>
         <w:t>_</w:t>
       </w:r>
-      <w:proofErr w:type="gramStart"/>
       <w:r>
         <w:rPr>
           <w:rFonts w:cs="Times New Roman"/>
@@ -11156,7 +11141,6 @@
         </w:rPr>
         <w:t>parquet</w:t>
       </w:r>
-      <w:proofErr w:type="gramEnd"/>
       <w:r>
         <w:rPr>
           <w:rFonts w:cs="Times New Roman"/>
@@ -11198,7 +11182,6 @@
         </w:rPr>
         <w:t>_</w:t>
       </w:r>
-      <w:proofErr w:type="gramStart"/>
       <w:r>
         <w:rPr>
           <w:rFonts w:cs="Times New Roman"/>
@@ -11223,7 +11206,6 @@
         </w:rPr>
         <w:t>parquet</w:t>
       </w:r>
-      <w:proofErr w:type="gramEnd"/>
       <w:r>
         <w:rPr>
           <w:rFonts w:cs="Times New Roman"/>
@@ -11287,16 +11269,7 @@
           <w:szCs w:val="28"/>
           <w:lang w:val="ru-RU" w:eastAsia="ru-RU"/>
         </w:rPr>
-        <w:t xml:space="preserve">сохранялись в </w:t>
-      </w:r>
-      <w:proofErr w:type="gramStart"/>
-      <w:r>
-        <w:rPr>
-          <w:rFonts w:cs="Times New Roman"/>
-          <w:szCs w:val="28"/>
-          <w:lang w:val="ru-RU" w:eastAsia="ru-RU"/>
-        </w:rPr>
-        <w:t>формате .</w:t>
+        <w:t>сохранялись в формате .</w:t>
       </w:r>
       <w:proofErr w:type="spellStart"/>
       <w:r>
@@ -11308,7 +11281,6 @@
         <w:t>npz</w:t>
       </w:r>
       <w:proofErr w:type="spellEnd"/>
-      <w:proofErr w:type="gramEnd"/>
       <w:r>
         <w:rPr>
           <w:rFonts w:cs="Times New Roman"/>
@@ -11317,7 +11289,6 @@
         </w:rPr>
         <w:t xml:space="preserve">. Для каждого набора данных создавался также файл </w:t>
       </w:r>
-      <w:proofErr w:type="gramStart"/>
       <w:r>
         <w:rPr>
           <w:rFonts w:cs="Times New Roman"/>
@@ -11344,7 +11315,6 @@
         <w:t>json</w:t>
       </w:r>
       <w:proofErr w:type="spellEnd"/>
-      <w:proofErr w:type="gramEnd"/>
       <w:r>
         <w:rPr>
           <w:rFonts w:cs="Times New Roman"/>
@@ -11478,7 +11448,6 @@
         </w:rPr>
         <w:t>_</w:t>
       </w:r>
-      <w:proofErr w:type="gramStart"/>
       <w:r>
         <w:rPr>
           <w:rFonts w:cs="Times New Roman"/>
@@ -11503,7 +11472,6 @@
         </w:rPr>
         <w:t>parquet</w:t>
       </w:r>
-      <w:proofErr w:type="gramEnd"/>
       <w:r>
         <w:rPr>
           <w:rFonts w:cs="Times New Roman"/>
@@ -12222,7 +12190,6 @@
         </w:rPr>
         <w:t>_</w:t>
       </w:r>
-      <w:proofErr w:type="gramStart"/>
       <w:r>
         <w:rPr>
           <w:lang w:eastAsia="ru-RU"/>
@@ -12241,7 +12208,6 @@
         </w:rPr>
         <w:t>parquet</w:t>
       </w:r>
-      <w:proofErr w:type="gramEnd"/>
       <w:r>
         <w:rPr>
           <w:lang w:val="ru-RU" w:eastAsia="ru-RU"/>
@@ -12258,14 +12224,7 @@
         <w:rPr>
           <w:lang w:val="ru-RU" w:eastAsia="ru-RU"/>
         </w:rPr>
-        <w:t xml:space="preserve"> </w:t>
-      </w:r>
-      <w:proofErr w:type="gramStart"/>
-      <w:r>
-        <w:rPr>
-          <w:lang w:val="ru-RU" w:eastAsia="ru-RU"/>
-        </w:rPr>
-        <w:t xml:space="preserve">&lt; </w:t>
+        <w:t xml:space="preserve"> &lt; </w:t>
       </w:r>
       <w:r>
         <w:rPr>
@@ -12273,7 +12232,6 @@
         </w:rPr>
         <w:t>train</w:t>
       </w:r>
-      <w:proofErr w:type="gramEnd"/>
       <w:r>
         <w:rPr>
           <w:lang w:val="ru-RU" w:eastAsia="ru-RU"/>
@@ -12774,17 +12732,9 @@
         <w:rPr>
           <w:lang w:val="ru-RU" w:eastAsia="ru-RU"/>
         </w:rPr>
-        <w:t xml:space="preserve">в </w:t>
-      </w:r>
-      <w:proofErr w:type="gramStart"/>
-      <w:r>
-        <w:rPr>
-          <w:lang w:val="ru-RU" w:eastAsia="ru-RU"/>
-        </w:rPr>
-        <w:t>формате .</w:t>
+        <w:t>в формате .</w:t>
       </w:r>
       <w:proofErr w:type="spellStart"/>
-      <w:proofErr w:type="gramEnd"/>
       <w:r>
         <w:rPr>
           <w:lang w:val="ru-RU" w:eastAsia="ru-RU"/>
@@ -12836,17 +12786,9 @@
         <w:rPr>
           <w:lang w:val="ru-RU" w:eastAsia="ru-RU"/>
         </w:rPr>
-        <w:t>valid_</w:t>
-      </w:r>
-      <w:proofErr w:type="gramStart"/>
-      <w:r>
-        <w:rPr>
-          <w:lang w:val="ru-RU" w:eastAsia="ru-RU"/>
-        </w:rPr>
-        <w:t>predictions.parquet</w:t>
+        <w:t>valid_predictions.parquet</w:t>
       </w:r>
       <w:proofErr w:type="spellEnd"/>
-      <w:proofErr w:type="gramEnd"/>
       <w:r>
         <w:rPr>
           <w:lang w:val="ru-RU" w:eastAsia="ru-RU"/>
@@ -12870,17 +12812,9 @@
         <w:rPr>
           <w:lang w:val="ru-RU" w:eastAsia="ru-RU"/>
         </w:rPr>
-        <w:t>test_</w:t>
-      </w:r>
-      <w:proofErr w:type="gramStart"/>
-      <w:r>
-        <w:rPr>
-          <w:lang w:val="ru-RU" w:eastAsia="ru-RU"/>
-        </w:rPr>
-        <w:t>predictions.parquet</w:t>
+        <w:t>test_predictions.parquet</w:t>
       </w:r>
       <w:proofErr w:type="spellEnd"/>
-      <w:proofErr w:type="gramEnd"/>
       <w:r>
         <w:rPr>
           <w:lang w:val="ru-RU" w:eastAsia="ru-RU"/>
@@ -16376,15 +16310,7 @@
         <w:t>.</w:t>
       </w:r>
       <w:r>
-        <w:t xml:space="preserve"> de Jong F., Rindi B. The Microstructure of Financial Markets. </w:t>
-      </w:r>
-      <w:proofErr w:type="gramStart"/>
-      <w:r>
-        <w:t>Cambridge :</w:t>
-      </w:r>
-      <w:proofErr w:type="gramEnd"/>
-      <w:r>
-        <w:t xml:space="preserve"> Cambridge University Press, 2009. 210 </w:t>
+        <w:t xml:space="preserve"> de Jong F., Rindi B. The Microstructure of Financial Markets. Cambridge : Cambridge University Press, 2009. 210 </w:t>
       </w:r>
       <w:r>
         <w:rPr>
@@ -16441,15 +16367,7 @@
         <w:t>.</w:t>
       </w:r>
       <w:r>
-        <w:t xml:space="preserve"> López de Prado M. Advances in Financial Machine Learning. </w:t>
-      </w:r>
-      <w:proofErr w:type="gramStart"/>
-      <w:r>
-        <w:t>Hoboken :</w:t>
-      </w:r>
-      <w:proofErr w:type="gramEnd"/>
-      <w:r>
-        <w:t xml:space="preserve"> Wiley, 2018. 400 </w:t>
+        <w:t xml:space="preserve"> López de Prado M. Advances in Financial Machine Learning. Hoboken : Wiley, 2018. 400 </w:t>
       </w:r>
       <w:r>
         <w:rPr>
@@ -16473,15 +16391,7 @@
         <w:t>.</w:t>
       </w:r>
       <w:r>
-        <w:t xml:space="preserve"> Chan E. P. Algorithmic Trading: Winning Strategies and Their Rationale. </w:t>
-      </w:r>
-      <w:proofErr w:type="gramStart"/>
-      <w:r>
-        <w:t>Hoboken :</w:t>
-      </w:r>
-      <w:proofErr w:type="gramEnd"/>
-      <w:r>
-        <w:t xml:space="preserve"> Wiley, 2013. 224 </w:t>
+        <w:t xml:space="preserve"> Chan E. P. Algorithmic Trading: Winning Strategies and Their Rationale. Hoboken : Wiley, 2013. 224 </w:t>
       </w:r>
       <w:r>
         <w:rPr>
@@ -16562,15 +16472,7 @@
       </w:r>
       <w:proofErr w:type="spellEnd"/>
       <w:r>
-        <w:t xml:space="preserve"> R. A., Stone C. J. Classification and Regression Trees. </w:t>
-      </w:r>
-      <w:proofErr w:type="gramStart"/>
-      <w:r>
-        <w:t>Belmont :</w:t>
-      </w:r>
-      <w:proofErr w:type="gramEnd"/>
-      <w:r>
-        <w:t xml:space="preserve"> Wadsworth International Group, 1984. 368 </w:t>
+        <w:t xml:space="preserve"> R. A., Stone C. J. Classification and Regression Trees. Belmont : Wadsworth International Group, 1984. 368 </w:t>
       </w:r>
       <w:r>
         <w:rPr>
@@ -16671,14 +16573,24 @@
       <w:r>
         <w:t xml:space="preserve">. 6639–6649. URL: </w:t>
       </w:r>
-      <w:hyperlink r:id="rId27" w:tgtFrame="_new" w:history="1">
-        <w:r>
-          <w:rPr>
-            <w:rStyle w:val="aff"/>
-          </w:rPr>
-          <w:t>https://arxiv.org/abs/1706.09516</w:t>
-        </w:r>
-      </w:hyperlink>
+      <w:r>
+        <w:fldChar w:fldCharType="begin"/>
+      </w:r>
+      <w:r>
+        <w:instrText>HYPERLINK "https://arxiv.org/abs/1706.09516" \t "_new"</w:instrText>
+      </w:r>
+      <w:r>
+        <w:fldChar w:fldCharType="separate"/>
+      </w:r>
+      <w:r>
+        <w:rPr>
+          <w:rStyle w:val="aff"/>
+        </w:rPr>
+        <w:t>https://arxiv.org/abs/1706.09516</w:t>
+      </w:r>
+      <w:r>
+        <w:fldChar w:fldCharType="end"/>
+      </w:r>
       <w:r>
         <w:t xml:space="preserve"> (</w:t>
       </w:r>
@@ -16715,14 +16627,24 @@
       <w:r>
         <w:t xml:space="preserve"> Bai S., Kolter J. Z., Koltun V. An Empirical Evaluation of Generic Convolutional and Recurrent Networks for Sequence Modeling. 2018. URL: </w:t>
       </w:r>
-      <w:hyperlink r:id="rId28" w:tgtFrame="_new" w:history="1">
-        <w:r>
-          <w:rPr>
-            <w:rStyle w:val="aff"/>
-          </w:rPr>
-          <w:t>https://arxiv.org/abs/1803.01271</w:t>
-        </w:r>
-      </w:hyperlink>
+      <w:r>
+        <w:fldChar w:fldCharType="begin"/>
+      </w:r>
+      <w:r>
+        <w:instrText>HYPERLINK "https://arxiv.org/abs/1803.01271" \t "_new"</w:instrText>
+      </w:r>
+      <w:r>
+        <w:fldChar w:fldCharType="separate"/>
+      </w:r>
+      <w:r>
+        <w:rPr>
+          <w:rStyle w:val="aff"/>
+        </w:rPr>
+        <w:t>https://arxiv.org/abs/1803.01271</w:t>
+      </w:r>
+      <w:r>
+        <w:fldChar w:fldCharType="end"/>
+      </w:r>
       <w:r>
         <w:t xml:space="preserve"> (</w:t>
       </w:r>
@@ -16767,14 +16689,24 @@
       <w:r>
         <w:t xml:space="preserve"> C., Cho K., Bengio Y. Empirical Evaluation of Gated Recurrent Neural Networks on Sequence Modeling. 2014. URL: </w:t>
       </w:r>
-      <w:hyperlink r:id="rId29" w:tgtFrame="_new" w:history="1">
-        <w:r>
-          <w:rPr>
-            <w:rStyle w:val="aff"/>
-          </w:rPr>
-          <w:t>https://arxiv.org/abs/1412.3555</w:t>
-        </w:r>
-      </w:hyperlink>
+      <w:r>
+        <w:fldChar w:fldCharType="begin"/>
+      </w:r>
+      <w:r>
+        <w:instrText>HYPERLINK "https://arxiv.org/abs/1412.3555" \t "_new"</w:instrText>
+      </w:r>
+      <w:r>
+        <w:fldChar w:fldCharType="separate"/>
+      </w:r>
+      <w:r>
+        <w:rPr>
+          <w:rStyle w:val="aff"/>
+        </w:rPr>
+        <w:t>https://arxiv.org/abs/1412.3555</w:t>
+      </w:r>
+      <w:r>
+        <w:fldChar w:fldCharType="end"/>
+      </w:r>
       <w:r>
         <w:t xml:space="preserve"> (</w:t>
       </w:r>
@@ -16880,14 +16812,24 @@
       <w:r>
         <w:t xml:space="preserve"> I. Attention Is All You Need. 2017. URL: </w:t>
       </w:r>
-      <w:hyperlink r:id="rId30" w:tgtFrame="_new" w:history="1">
-        <w:r>
-          <w:rPr>
-            <w:rStyle w:val="aff"/>
-          </w:rPr>
-          <w:t>https://arxiv.org/abs/1706.03762</w:t>
-        </w:r>
-      </w:hyperlink>
+      <w:r>
+        <w:fldChar w:fldCharType="begin"/>
+      </w:r>
+      <w:r>
+        <w:instrText>HYPERLINK "https://arxiv.org/abs/1706.03762" \t "_new"</w:instrText>
+      </w:r>
+      <w:r>
+        <w:fldChar w:fldCharType="separate"/>
+      </w:r>
+      <w:r>
+        <w:rPr>
+          <w:rStyle w:val="aff"/>
+        </w:rPr>
+        <w:t>https://arxiv.org/abs/1706.03762</w:t>
+      </w:r>
+      <w:r>
+        <w:fldChar w:fldCharType="end"/>
+      </w:r>
       <w:r>
         <w:t xml:space="preserve"> (</w:t>
       </w:r>
@@ -16924,14 +16866,24 @@
       <w:r>
         <w:t xml:space="preserve"> Zhou H., Zhang S., Peng J., Zhang S., Li J., Xiong H., Zhang W. Informer: Beyond Efficient Transformer for Long Sequence Time-Series Forecasting. 2020. URL: </w:t>
       </w:r>
-      <w:hyperlink r:id="rId31" w:tgtFrame="_new" w:history="1">
-        <w:r>
-          <w:rPr>
-            <w:rStyle w:val="aff"/>
-          </w:rPr>
-          <w:t>https://arxiv.org/abs/2012.07436</w:t>
-        </w:r>
-      </w:hyperlink>
+      <w:r>
+        <w:fldChar w:fldCharType="begin"/>
+      </w:r>
+      <w:r>
+        <w:instrText>HYPERLINK "https://arxiv.org/abs/2012.07436" \t "_new"</w:instrText>
+      </w:r>
+      <w:r>
+        <w:fldChar w:fldCharType="separate"/>
+      </w:r>
+      <w:r>
+        <w:rPr>
+          <w:rStyle w:val="aff"/>
+        </w:rPr>
+        <w:t>https://arxiv.org/abs/2012.07436</w:t>
+      </w:r>
+      <w:r>
+        <w:fldChar w:fldCharType="end"/>
+      </w:r>
       <w:r>
         <w:t xml:space="preserve"> (</w:t>
       </w:r>
@@ -16968,14 +16920,24 @@
       <w:r>
         <w:t xml:space="preserve"> Hyndman R. J., Athanasopoulos G. Forecasting: Principles and Practice. 3rd ed. URL: </w:t>
       </w:r>
-      <w:hyperlink r:id="rId32" w:tgtFrame="_new" w:history="1">
-        <w:r>
-          <w:rPr>
-            <w:rStyle w:val="aff"/>
-          </w:rPr>
-          <w:t>https://otexts.com/fpp3/</w:t>
-        </w:r>
-      </w:hyperlink>
+      <w:r>
+        <w:fldChar w:fldCharType="begin"/>
+      </w:r>
+      <w:r>
+        <w:instrText>HYPERLINK "https://otexts.com/fpp3/" \t "_new"</w:instrText>
+      </w:r>
+      <w:r>
+        <w:fldChar w:fldCharType="separate"/>
+      </w:r>
+      <w:r>
+        <w:rPr>
+          <w:rStyle w:val="aff"/>
+        </w:rPr>
+        <w:t>https://otexts.com/fpp3/</w:t>
+      </w:r>
+      <w:r>
+        <w:fldChar w:fldCharType="end"/>
+      </w:r>
       <w:r>
         <w:t xml:space="preserve"> (</w:t>
       </w:r>
@@ -17119,7 +17081,7 @@
         </w:rPr>
         <w:t xml:space="preserve"> Московская биржа. ISS API. URL: </w:t>
       </w:r>
-      <w:hyperlink r:id="rId33" w:tgtFrame="_new" w:history="1">
+      <w:hyperlink r:id="rId27" w:tgtFrame="_new" w:history="1">
         <w:r>
           <w:rPr>
             <w:rStyle w:val="aff"/>
@@ -17145,7 +17107,7 @@
       </w:pPr>
     </w:p>
     <w:sectPr>
-      <w:footerReference w:type="default" r:id="rId34"/>
+      <w:footerReference w:type="default" r:id="rId28"/>
       <w:pgSz w:w="11906" w:h="16838"/>
       <w:pgMar w:top="1134" w:right="707" w:bottom="1134" w:left="1701" w:header="720" w:footer="720" w:gutter="0"/>
       <w:pgNumType w:start="3"/>
@@ -18081,6 +18043,7 @@
   <w:style w:type="character" w:default="1" w:styleId="a1">
     <w:name w:val="Default Paragraph Font"/>
     <w:uiPriority w:val="1"/>
+    <w:semiHidden/>
     <w:unhideWhenUsed/>
   </w:style>
   <w:style w:type="table" w:default="1" w:styleId="a2">

</xml_diff>